<commit_message>
Semplifica 4 stazioni della scheda Under 15 pesi
Cerniera d'anca, spinta, trazione e core sostituite con esercizi più
diretti e immediati da spiegare in una scheda iniziale: ponte a terra
(glutei), piegamenti sulle braccia (spinta), apertura con elastico
(trazione), plank e crunch (core).

Co-Authored-By: Claude Sonnet 5 <noreply@anthropic.com>
Claude-Session: https://claude.ai/code/session_012RTNkv1vzcBPNvsTb7GDtg
</commit_message>
<xml_diff>
--- a/under-15/Under 15 - Forza in sala pesi - 45 minuti.docx
+++ b/under-15/Under 15 - Forza in sala pesi - 45 minuti.docx
@@ -20,7 +20,7 @@
     </w:p>
     <w:p>
       <w:r>
-        <w:t>Primo blocco di sala pesi: tecnica prima del carico. Si parte a corpo libero o con carichi minimi (manubri leggeri, kettlebell leggero, disco leggero); si aggiunge peso solo quando il movimento resta pulito e controllato per tutta la serie. Niente stacco: la cerniera d'anca si allena come pattern, senza sovraccarico esterno.</w:t>
+        <w:t>Primo blocco di sala pesi: tecnica prima del carico, esercizi semplici e diretti. Si parte a corpo libero o con carichi minimi (manubri leggeri); si aggiunge peso solo quando il movimento resta pulito e controllato per tutta la serie. Niente stacco in questo blocco.</w:t>
       </w:r>
     </w:p>
     <w:p>
@@ -85,31 +85,31 @@
         <w:pStyle w:val="Heading3"/>
       </w:pPr>
       <w:r>
-        <w:t>Stazione 3 — Cerniera d'anca</w:t>
-      </w:r>
-    </w:p>
-    <w:p>
-      <w:pPr>
-        <w:pStyle w:val="ListParagraph"/>
-        <w:numPr>
-          <w:ilvl w:val="0"/>
-          <w:numId w:val="2"/>
-        </w:numPr>
-      </w:pPr>
-      <w:r>
-        <w:t>Hip hinge con bastone lungo la schiena, a contatto con testa, scapole e bacino — 2 × 8, spingere le anche indietro senza flettere la colonna</w:t>
-      </w:r>
-    </w:p>
-    <w:p>
-      <w:pPr>
-        <w:pStyle w:val="ListParagraph"/>
-        <w:numPr>
-          <w:ilvl w:val="0"/>
-          <w:numId w:val="2"/>
-        </w:numPr>
-      </w:pPr>
-      <w:r>
-        <w:t>Ponte a terra — 1 × 15</w:t>
+        <w:t>Stazione 3 — Glutei</w:t>
+      </w:r>
+    </w:p>
+    <w:p>
+      <w:pPr>
+        <w:pStyle w:val="ListParagraph"/>
+        <w:numPr>
+          <w:ilvl w:val="0"/>
+          <w:numId w:val="2"/>
+        </w:numPr>
+      </w:pPr>
+      <w:r>
+        <w:t>Ponte a terra a due gambe — 2 × 15</w:t>
+      </w:r>
+    </w:p>
+    <w:p>
+      <w:pPr>
+        <w:pStyle w:val="ListParagraph"/>
+        <w:numPr>
+          <w:ilvl w:val="0"/>
+          <w:numId w:val="2"/>
+        </w:numPr>
+      </w:pPr>
+      <w:r>
+        <w:t>Ponte a terra monopodalico — 2 × 8 per lato</w:t>
       </w:r>
     </w:p>
     <w:p>
@@ -149,19 +149,7 @@
         </w:numPr>
       </w:pPr>
       <w:r>
-        <w:t>Spinte con manubri leggeri, sdraiate a terra — 2 × 8, tecnica e traiettoria del manubrio</w:t>
-      </w:r>
-    </w:p>
-    <w:p>
-      <w:pPr>
-        <w:pStyle w:val="ListParagraph"/>
-        <w:numPr>
-          <w:ilvl w:val="0"/>
-          <w:numId w:val="2"/>
-        </w:numPr>
-      </w:pPr>
-      <w:r>
-        <w:t>Cuffia dei rotatori con elastico — 1 × 12 per lato</w:t>
+        <w:t>Piegamenti sulle braccia, in ginocchio se necessario — 2 × 10</w:t>
       </w:r>
     </w:p>
     <w:p>
@@ -181,19 +169,7 @@
         </w:numPr>
       </w:pPr>
       <w:r>
-        <w:t>Rematore in piedi con elastico, gomiti vicino al corpo — 2 × 10</w:t>
-      </w:r>
-    </w:p>
-    <w:p>
-      <w:pPr>
-        <w:pStyle w:val="ListParagraph"/>
-        <w:numPr>
-          <w:ilvl w:val="0"/>
-          <w:numId w:val="2"/>
-        </w:numPr>
-      </w:pPr>
-      <w:r>
-        <w:t>Trazione assistita alla sbarra con elastico, solo per chi ha già una base — 2 × 5</w:t>
+        <w:t>Apertura con elastico, braccia tese in avanti — 2 × 12</w:t>
       </w:r>
     </w:p>
     <w:p>
@@ -245,7 +221,7 @@
         </w:numPr>
       </w:pPr>
       <w:r>
-        <w:t>Dead bug — 2 × 8 per lato</w:t>
+        <w:t>Crunch a terra — 2 × 15</w:t>
       </w:r>
     </w:p>
     <w:sectPr>

</xml_diff>